<commit_message>
Add LaTeX-sourced native Word equations (1)-(5) to journal manuscript
- Five formal display equations added to the empirical strategy section:
  (1) Mincer wage equation, (2) Oaxaca-Blinder decomposition,
  (3) female-occupation interaction model, (4) Nopo decomposition,
  (5) Heckman second stage with inverse Mills ratio
- Equations written in LaTeX in the markdown source (518...518 (N) blocks)
  and converted to native editable Word OMML equations via
  latex2mathml + Office's MML2OMML.XSL transform -- satisfies the
  journal's editable-content and numbered-equations requirements
- Centered layout with right-aligned equation numbers via tab stops
- Rendering verified by exporting through Word COM to PDF and visually
  inspecting the typeset math (Cambria Math)

Co-Authored-By: Claude Fable 5 <noreply@anthropic.com>
</commit_message>
<xml_diff>
--- a/policy_paper/articulo/envio_estudios_de_economia/manuscrito_estudios_economia.docx
+++ b/policy_paper/articulo/envio_estudios_de_economia/manuscrito_estudios_economia.docx
@@ -399,10 +399,103 @@
     </w:p>
     <w:p>
       <w:pPr>
-        <w:jc w:val="both"/>
+        <w:tabs>
+          <w:tab w:pos="4252" w:val="center"/>
+          <w:tab w:pos="8504" w:val="right"/>
+        </w:tabs>
+        <w:spacing w:before="120" w:after="120"/>
       </w:pPr>
       <w:r>
-        <w:t>ln w_i = α + δ·Female_i + x_i'β + θ_o(i) + ε_i,  (1)</w:t>
+        <w:tab/>
+      </w:r>
+      <m:oMath>
+        <m:r>
+          <m:rPr>
+            <m:sty m:val="p"/>
+          </m:rPr>
+          <m:t>ln</m:t>
+        </m:r>
+        <m:sSub>
+          <m:e>
+            <m:r>
+              <m:t>w</m:t>
+            </m:r>
+          </m:e>
+          <m:sub>
+            <m:r>
+              <m:t>i</m:t>
+            </m:r>
+          </m:sub>
+        </m:sSub>
+        <m:r>
+          <m:t>=α+δ</m:t>
+        </m:r>
+        <m:sSub>
+          <m:e>
+            <m:r>
+              <m:t>F</m:t>
+            </m:r>
+          </m:e>
+          <m:sub>
+            <m:r>
+              <m:t>i</m:t>
+            </m:r>
+          </m:sub>
+        </m:sSub>
+        <m:r>
+          <m:t>+</m:t>
+        </m:r>
+        <m:sSubSup>
+          <m:e>
+            <m:r>
+              <m:t>x</m:t>
+            </m:r>
+          </m:e>
+          <m:sub>
+            <m:r>
+              <m:t>i</m:t>
+            </m:r>
+          </m:sub>
+          <m:sup>
+            <m:r>
+              <m:t>′</m:t>
+            </m:r>
+          </m:sup>
+        </m:sSubSup>
+        <m:r>
+          <m:t>β+</m:t>
+        </m:r>
+        <m:sSub>
+          <m:e>
+            <m:r>
+              <m:t>θ</m:t>
+            </m:r>
+          </m:e>
+          <m:sub>
+            <m:r>
+              <m:t>o(i)</m:t>
+            </m:r>
+          </m:sub>
+        </m:sSub>
+        <m:r>
+          <m:t>+</m:t>
+        </m:r>
+        <m:sSub>
+          <m:e>
+            <m:r>
+              <m:t>ε</m:t>
+            </m:r>
+          </m:e>
+          <m:sub>
+            <m:r>
+              <m:t>i</m:t>
+            </m:r>
+          </m:sub>
+        </m:sSub>
+      </m:oMath>
+      <w:r>
+        <w:tab/>
+        <w:t>(1)</w:t>
       </w:r>
     </w:p>
     <w:p>
@@ -410,7 +503,7 @@
         <w:jc w:val="both"/>
       </w:pPr>
       <w:r>
-        <w:t>where x_i contains age, age squared, educational level (five categories), weekly hours, and wave fixed effects, and θ_o(i) denotes occupation fixed effects. We estimate (1) twice, holding everything constant except the occupational classification: 1-digit ISCO (roughly nine categories, the maximum available in standard employment surveys) versus 4-digit ISCO (354 categories). The difference between the two estimates of δ isolates the pure contribution of occupational granularity. The adjusted gap in percentage terms is 100·(exp(δ)−1).</w:t>
+        <w:t>where F_i is an indicator for women, x_i contains age, age squared, educational level (five categories), weekly hours, and wave fixed effects, and θ_o(i) denotes occupation fixed effects. We estimate (1) twice, holding everything constant except the occupational classification: 1-digit ISCO (roughly nine categories, the maximum available in standard employment surveys) versus 4-digit ISCO (354 categories). The difference between the two estimates of δ isolates the pure contribution of occupational granularity. The adjusted gap in percentage terms is 100·(exp(δ)−1).</w:t>
       </w:r>
     </w:p>
     <w:p>
@@ -431,7 +524,238 @@
         <w:jc w:val="both"/>
       </w:pPr>
       <w:r>
-        <w:t>We decompose the total log gap with the Oaxaca (1973)-Blinder (1973) procedure, grouping detailed contributions into variable families (hours, occupation, education, age, family structure, formality, year) and, following Neumark (1988), reporting male, female, and pooled reference coefficient vectors to address the index number problem. Because high-dimensional categorical variables make detailed decompositions sensitive to the choice of base categories, family-level percentages should be read as orders of magnitude.</w:t>
+        <w:t>We decompose the total log gap with the Oaxaca (1973)-Blinder (1973) procedure:</w:t>
+      </w:r>
+    </w:p>
+    <w:p>
+      <w:pPr>
+        <w:tabs>
+          <w:tab w:pos="4252" w:val="center"/>
+          <w:tab w:pos="8504" w:val="right"/>
+        </w:tabs>
+        <w:spacing w:before="120" w:after="120"/>
+      </w:pPr>
+      <w:r>
+        <w:tab/>
+      </w:r>
+      <m:oMath>
+        <m:r>
+          <m:t>Δ≡</m:t>
+        </m:r>
+        <m:sSub>
+          <m:e>
+            <m:acc>
+              <m:accPr>
+                <m:chr m:val="―"/>
+              </m:accPr>
+              <m:e>
+                <m:r>
+                  <m:rPr>
+                    <m:sty m:val="p"/>
+                  </m:rPr>
+                  <m:t>ln</m:t>
+                </m:r>
+                <m:r>
+                  <m:t>w</m:t>
+                </m:r>
+              </m:e>
+            </m:acc>
+          </m:e>
+          <m:sub>
+            <m:r>
+              <m:t>m</m:t>
+            </m:r>
+          </m:sub>
+        </m:sSub>
+        <m:r>
+          <m:t>−</m:t>
+        </m:r>
+        <m:sSub>
+          <m:e>
+            <m:acc>
+              <m:accPr>
+                <m:chr m:val="―"/>
+              </m:accPr>
+              <m:e>
+                <m:r>
+                  <m:rPr>
+                    <m:sty m:val="p"/>
+                  </m:rPr>
+                  <m:t>ln</m:t>
+                </m:r>
+                <m:r>
+                  <m:t>w</m:t>
+                </m:r>
+              </m:e>
+            </m:acc>
+          </m:e>
+          <m:sub>
+            <m:r>
+              <m:t>f</m:t>
+            </m:r>
+          </m:sub>
+        </m:sSub>
+        <m:r>
+          <m:t>=(</m:t>
+        </m:r>
+        <m:sSub>
+          <m:e>
+            <m:bar>
+              <m:barPr>
+                <m:pos m:val="top"/>
+              </m:barPr>
+              <m:e>
+                <m:r>
+                  <m:t>x</m:t>
+                </m:r>
+              </m:e>
+            </m:bar>
+          </m:e>
+          <m:sub>
+            <m:r>
+              <m:t>m</m:t>
+            </m:r>
+          </m:sub>
+        </m:sSub>
+        <m:r>
+          <m:t>−</m:t>
+        </m:r>
+        <m:sSub>
+          <m:e>
+            <m:bar>
+              <m:barPr>
+                <m:pos m:val="top"/>
+              </m:barPr>
+              <m:e>
+                <m:r>
+                  <m:t>x</m:t>
+                </m:r>
+              </m:e>
+            </m:bar>
+          </m:e>
+          <m:sub>
+            <m:r>
+              <m:t>f</m:t>
+            </m:r>
+          </m:sub>
+        </m:sSub>
+        <m:sSup>
+          <m:e>
+            <m:r>
+              <m:t>)</m:t>
+            </m:r>
+          </m:e>
+          <m:sup>
+            <m:r>
+              <m:t>′</m:t>
+            </m:r>
+          </m:sup>
+        </m:sSup>
+        <m:sSub>
+          <m:e>
+            <m:acc>
+              <m:accPr>
+                <m:chr m:val="̂"/>
+              </m:accPr>
+              <m:e>
+                <m:r>
+                  <m:t>β</m:t>
+                </m:r>
+              </m:e>
+            </m:acc>
+          </m:e>
+          <m:sub>
+            <m:r>
+              <m:t>m</m:t>
+            </m:r>
+          </m:sub>
+        </m:sSub>
+        <m:r>
+          <m:t>+</m:t>
+        </m:r>
+        <m:sSubSup>
+          <m:e>
+            <m:bar>
+              <m:barPr>
+                <m:pos m:val="top"/>
+              </m:barPr>
+              <m:e>
+                <m:r>
+                  <m:t>x</m:t>
+                </m:r>
+              </m:e>
+            </m:bar>
+          </m:e>
+          <m:sub>
+            <m:r>
+              <m:t>f</m:t>
+            </m:r>
+          </m:sub>
+          <m:sup>
+            <m:r>
+              <m:t>′</m:t>
+            </m:r>
+          </m:sup>
+        </m:sSubSup>
+        <m:r>
+          <m:t>(</m:t>
+        </m:r>
+        <m:sSub>
+          <m:e>
+            <m:acc>
+              <m:accPr>
+                <m:chr m:val="̂"/>
+              </m:accPr>
+              <m:e>
+                <m:r>
+                  <m:t>β</m:t>
+                </m:r>
+              </m:e>
+            </m:acc>
+          </m:e>
+          <m:sub>
+            <m:r>
+              <m:t>m</m:t>
+            </m:r>
+          </m:sub>
+        </m:sSub>
+        <m:r>
+          <m:t>−</m:t>
+        </m:r>
+        <m:sSub>
+          <m:e>
+            <m:acc>
+              <m:accPr>
+                <m:chr m:val="̂"/>
+              </m:accPr>
+              <m:e>
+                <m:r>
+                  <m:t>β</m:t>
+                </m:r>
+              </m:e>
+            </m:acc>
+          </m:e>
+          <m:sub>
+            <m:r>
+              <m:t>f</m:t>
+            </m:r>
+          </m:sub>
+        </m:sSub>
+        <m:r>
+          <m:t>)</m:t>
+        </m:r>
+      </m:oMath>
+      <w:r>
+        <w:tab/>
+        <w:t>(2)</w:t>
+      </w:r>
+    </w:p>
+    <w:p>
+      <w:pPr>
+        <w:jc w:val="both"/>
+      </w:pPr>
+      <w:r>
+        <w:t>where the first term is the component explained by average characteristics and the second the unexplained component. We group detailed contributions into variable families (hours, occupation, education, age, family structure, formality, year) and, following Neumark (1988), report male, female, and pooled reference coefficient vectors to address the index number problem. Because high-dimensional categorical variables make detailed decompositions sensitive to the choice of base categories, family-level percentages should be read as orders of magnitude.</w:t>
       </w:r>
     </w:p>
     <w:p>
@@ -452,7 +776,163 @@
         <w:jc w:val="both"/>
       </w:pPr>
       <w:r>
-        <w:t>To estimate a sex effect specific to each occupation without fitting 227 underpowered regressions, we estimate a single model interacting Female with occupation dummies, with common controls estimated on the full sample. The occupation-specific gap is recovered as a linear combination of coefficients, with variance from the cluster-robust covariance matrix. With 227 simultaneous tests, approximately 11 false positives are expected at p &lt; .05; we therefore report Benjamini-Hochberg false-discovery-rate and Bonferroni corrections.</w:t>
+        <w:t>To estimate a sex effect specific to each occupation without fitting 227 underpowered regressions, we estimate a single model interacting the female indicator with occupation dummies, with common controls estimated on the full sample:</w:t>
+      </w:r>
+    </w:p>
+    <w:p>
+      <w:pPr>
+        <w:tabs>
+          <w:tab w:pos="4252" w:val="center"/>
+          <w:tab w:pos="8504" w:val="right"/>
+        </w:tabs>
+        <w:spacing w:before="120" w:after="120"/>
+      </w:pPr>
+      <w:r>
+        <w:tab/>
+      </w:r>
+      <m:oMath>
+        <m:r>
+          <m:rPr>
+            <m:sty m:val="p"/>
+          </m:rPr>
+          <m:t>ln</m:t>
+        </m:r>
+        <m:sSub>
+          <m:e>
+            <m:r>
+              <m:t>w</m:t>
+            </m:r>
+          </m:e>
+          <m:sub>
+            <m:r>
+              <m:t>i</m:t>
+            </m:r>
+          </m:sub>
+        </m:sSub>
+        <m:r>
+          <m:t>=α+</m:t>
+        </m:r>
+        <m:nary>
+          <m:naryPr>
+            <m:chr m:val="∑"/>
+            <m:limLoc m:val="subSup"/>
+            <m:grow m:val="1"/>
+            <m:subHide m:val="off"/>
+            <m:supHide m:val="on"/>
+          </m:naryPr>
+          <m:sub>
+            <m:r>
+              <m:t>o</m:t>
+            </m:r>
+          </m:sub>
+          <m:sup/>
+          <m:e>
+            <m:r>
+              <m:t>(δ+</m:t>
+            </m:r>
+          </m:e>
+        </m:nary>
+        <m:sSub>
+          <m:e>
+            <m:r>
+              <m:t>γ</m:t>
+            </m:r>
+          </m:e>
+          <m:sub>
+            <m:r>
+              <m:t>o</m:t>
+            </m:r>
+          </m:sub>
+        </m:sSub>
+        <m:r>
+          <m:t>)</m:t>
+        </m:r>
+        <m:sSub>
+          <m:e>
+            <m:r>
+              <m:t>F</m:t>
+            </m:r>
+          </m:e>
+          <m:sub>
+            <m:r>
+              <m:t>i</m:t>
+            </m:r>
+          </m:sub>
+        </m:sSub>
+        <m:sSub>
+          <m:e>
+            <m:r>
+              <m:t>D</m:t>
+            </m:r>
+          </m:e>
+          <m:sub>
+            <m:r>
+              <m:t>io</m:t>
+            </m:r>
+          </m:sub>
+        </m:sSub>
+        <m:r>
+          <m:t>+</m:t>
+        </m:r>
+        <m:sSubSup>
+          <m:e>
+            <m:r>
+              <m:t>x</m:t>
+            </m:r>
+          </m:e>
+          <m:sub>
+            <m:r>
+              <m:t>i</m:t>
+            </m:r>
+          </m:sub>
+          <m:sup>
+            <m:r>
+              <m:t>′</m:t>
+            </m:r>
+          </m:sup>
+        </m:sSubSup>
+        <m:r>
+          <m:t>β+</m:t>
+        </m:r>
+        <m:sSub>
+          <m:e>
+            <m:r>
+              <m:t>θ</m:t>
+            </m:r>
+          </m:e>
+          <m:sub>
+            <m:r>
+              <m:t>o(i)</m:t>
+            </m:r>
+          </m:sub>
+        </m:sSub>
+        <m:r>
+          <m:t>+</m:t>
+        </m:r>
+        <m:sSub>
+          <m:e>
+            <m:r>
+              <m:t>ε</m:t>
+            </m:r>
+          </m:e>
+          <m:sub>
+            <m:r>
+              <m:t>i</m:t>
+            </m:r>
+          </m:sub>
+        </m:sSub>
+      </m:oMath>
+      <w:r>
+        <w:tab/>
+        <w:t>(3)</w:t>
+      </w:r>
+    </w:p>
+    <w:p>
+      <w:pPr>
+        <w:jc w:val="both"/>
+      </w:pPr>
+      <w:r>
+        <w:t>where D_io indicates occupation o. The occupation-specific gap δ + γ_o is recovered as a linear combination of coefficients, with variance from the cluster-robust covariance matrix. With 227 simultaneous tests, approximately 11 false positives are expected at p &lt; .05; we therefore report Benjamini-Hochberg false-discovery-rate and Bonferroni corrections.</w:t>
       </w:r>
     </w:p>
     <w:p>
@@ -473,7 +953,93 @@
         <w:jc w:val="both"/>
       </w:pPr>
       <w:r>
-        <w:t>Following Ñopo (2008), we decompose the gap by exact matching on characteristic cells: Δ = Δ0 + ΔX + ΔM + ΔF, where Δ0 is the unexplained difference between comparable men and women within the common support (reweighting the male cell distribution to the female one), ΔX captures distribution differences within the support, and ΔM, ΔF the parts attributable to individuals without an exact counterpart of the other sex. The method imposes no functional form and does not extrapolate outside the support; additivity is verified exactly. Inference uses a 500-replication bootstrap.</w:t>
+        <w:t>Following Ñopo (2008), we decompose the gap by exact matching on characteristic cells:</w:t>
+      </w:r>
+    </w:p>
+    <w:p>
+      <w:pPr>
+        <w:tabs>
+          <w:tab w:pos="4252" w:val="center"/>
+          <w:tab w:pos="8504" w:val="right"/>
+        </w:tabs>
+        <w:spacing w:before="120" w:after="120"/>
+      </w:pPr>
+      <w:r>
+        <w:tab/>
+      </w:r>
+      <m:oMath>
+        <m:r>
+          <m:t>Δ=</m:t>
+        </m:r>
+        <m:sSub>
+          <m:e>
+            <m:r>
+              <m:t>Δ</m:t>
+            </m:r>
+          </m:e>
+          <m:sub>
+            <m:r>
+              <m:t>0</m:t>
+            </m:r>
+          </m:sub>
+        </m:sSub>
+        <m:r>
+          <m:t>+</m:t>
+        </m:r>
+        <m:sSub>
+          <m:e>
+            <m:r>
+              <m:t>Δ</m:t>
+            </m:r>
+          </m:e>
+          <m:sub>
+            <m:r>
+              <m:t>X</m:t>
+            </m:r>
+          </m:sub>
+        </m:sSub>
+        <m:r>
+          <m:t>+</m:t>
+        </m:r>
+        <m:sSub>
+          <m:e>
+            <m:r>
+              <m:t>Δ</m:t>
+            </m:r>
+          </m:e>
+          <m:sub>
+            <m:r>
+              <m:t>M</m:t>
+            </m:r>
+          </m:sub>
+        </m:sSub>
+        <m:r>
+          <m:t>+</m:t>
+        </m:r>
+        <m:sSub>
+          <m:e>
+            <m:r>
+              <m:t>Δ</m:t>
+            </m:r>
+          </m:e>
+          <m:sub>
+            <m:r>
+              <m:t>F</m:t>
+            </m:r>
+          </m:sub>
+        </m:sSub>
+      </m:oMath>
+      <w:r>
+        <w:tab/>
+        <w:t>(4)</w:t>
+      </w:r>
+    </w:p>
+    <w:p>
+      <w:pPr>
+        <w:jc w:val="both"/>
+      </w:pPr>
+      <w:r>
+        <w:t>where Δ0 is the unexplained difference between comparable men and women within the common support (reweighting the male cell distribution to the female one), ΔX captures distribution differences within the support, and ΔM, ΔF the parts attributable to individuals without an exact counterpart of the other sex. The method imposes no functional form and does not extrapolate outside the support; additivity is verified exactly. Inference uses a 500-replication bootstrap.</w:t>
       </w:r>
     </w:p>
     <w:p>
@@ -494,7 +1060,238 @@
         <w:jc w:val="both"/>
       </w:pPr>
       <w:r>
-        <w:t>Because wages are observed only for workers and participation differs sharply by sex, we implement the Heckman (1979) two-step correction. The first stage is a participation probit on the 25-64 population with exclusion restrictions that plausibly shift participation but not conditional wages: presence of children, marital status, non-labor household income per capita, and their interactions with sex. The second stage adds the inverse Mills ratio to equation (1). Confidence intervals bootstrap both stages jointly (120 replications). As in any Heckman application, validity rests on the exclusion restrictions; we read the result as a robustness bound rather than causal identification.</w:t>
+        <w:t>Because wages are observed only for workers and participation differs sharply by sex, we implement the Heckman (1979) two-step correction. The first stage is a participation probit on the 25-64 population with exclusion restrictions that plausibly shift participation but not conditional wages: presence of children, marital status, non-labor household income per capita, and their interactions with sex. The second stage augments equation (1) with the inverse Mills ratio:</w:t>
+      </w:r>
+    </w:p>
+    <w:p>
+      <w:pPr>
+        <w:tabs>
+          <w:tab w:pos="4252" w:val="center"/>
+          <w:tab w:pos="8504" w:val="right"/>
+        </w:tabs>
+        <w:spacing w:before="120" w:after="120"/>
+      </w:pPr>
+      <w:r>
+        <w:tab/>
+      </w:r>
+      <m:oMath>
+        <m:r>
+          <m:rPr>
+            <m:sty m:val="p"/>
+          </m:rPr>
+          <m:t>ln</m:t>
+        </m:r>
+        <m:sSub>
+          <m:e>
+            <m:r>
+              <m:t>w</m:t>
+            </m:r>
+          </m:e>
+          <m:sub>
+            <m:r>
+              <m:t>i</m:t>
+            </m:r>
+          </m:sub>
+        </m:sSub>
+        <m:r>
+          <m:t>=α+δ</m:t>
+        </m:r>
+        <m:sSub>
+          <m:e>
+            <m:r>
+              <m:t>F</m:t>
+            </m:r>
+          </m:e>
+          <m:sub>
+            <m:r>
+              <m:t>i</m:t>
+            </m:r>
+          </m:sub>
+        </m:sSub>
+        <m:r>
+          <m:t>+</m:t>
+        </m:r>
+        <m:sSubSup>
+          <m:e>
+            <m:r>
+              <m:t>x</m:t>
+            </m:r>
+          </m:e>
+          <m:sub>
+            <m:r>
+              <m:t>i</m:t>
+            </m:r>
+          </m:sub>
+          <m:sup>
+            <m:r>
+              <m:t>′</m:t>
+            </m:r>
+          </m:sup>
+        </m:sSubSup>
+        <m:r>
+          <m:t>β+</m:t>
+        </m:r>
+        <m:sSub>
+          <m:e>
+            <m:r>
+              <m:t>θ</m:t>
+            </m:r>
+          </m:e>
+          <m:sub>
+            <m:r>
+              <m:t>o(i)</m:t>
+            </m:r>
+          </m:sub>
+        </m:sSub>
+        <m:r>
+          <m:t>+ρ</m:t>
+        </m:r>
+        <m:sSub>
+          <m:e>
+            <m:acc>
+              <m:accPr>
+                <m:chr m:val="̂"/>
+              </m:accPr>
+              <m:e>
+                <m:r>
+                  <m:t>λ</m:t>
+                </m:r>
+              </m:e>
+            </m:acc>
+          </m:e>
+          <m:sub>
+            <m:r>
+              <m:t>i</m:t>
+            </m:r>
+          </m:sub>
+        </m:sSub>
+        <m:r>
+          <m:t>+</m:t>
+        </m:r>
+        <m:sSub>
+          <m:e>
+            <m:r>
+              <m:t>ε</m:t>
+            </m:r>
+          </m:e>
+          <m:sub>
+            <m:r>
+              <m:t>i</m:t>
+            </m:r>
+          </m:sub>
+        </m:sSub>
+        <m:r>
+          <m:t>,</m:t>
+        </m:r>
+        <m:sSub>
+          <m:e>
+            <m:acc>
+              <m:accPr>
+                <m:chr m:val="̂"/>
+              </m:accPr>
+              <m:e>
+                <m:r>
+                  <m:t>λ</m:t>
+                </m:r>
+              </m:e>
+            </m:acc>
+          </m:e>
+          <m:sub>
+            <m:r>
+              <m:t>i</m:t>
+            </m:r>
+          </m:sub>
+        </m:sSub>
+        <m:r>
+          <m:t>=</m:t>
+        </m:r>
+        <m:f>
+          <m:fPr>
+            <m:type m:val="bar"/>
+          </m:fPr>
+          <m:num>
+            <m:r>
+              <m:t>ϕ(</m:t>
+            </m:r>
+            <m:sSubSup>
+              <m:e>
+                <m:r>
+                  <m:t>z</m:t>
+                </m:r>
+              </m:e>
+              <m:sub>
+                <m:r>
+                  <m:t>i</m:t>
+                </m:r>
+              </m:sub>
+              <m:sup>
+                <m:r>
+                  <m:t>′</m:t>
+                </m:r>
+              </m:sup>
+            </m:sSubSup>
+            <m:acc>
+              <m:accPr>
+                <m:chr m:val="̂"/>
+              </m:accPr>
+              <m:e>
+                <m:r>
+                  <m:t>γ</m:t>
+                </m:r>
+              </m:e>
+            </m:acc>
+            <m:r>
+              <m:t>)</m:t>
+            </m:r>
+          </m:num>
+          <m:den>
+            <m:r>
+              <m:t>Φ(</m:t>
+            </m:r>
+            <m:sSubSup>
+              <m:e>
+                <m:r>
+                  <m:t>z</m:t>
+                </m:r>
+              </m:e>
+              <m:sub>
+                <m:r>
+                  <m:t>i</m:t>
+                </m:r>
+              </m:sub>
+              <m:sup>
+                <m:r>
+                  <m:t>′</m:t>
+                </m:r>
+              </m:sup>
+            </m:sSubSup>
+            <m:acc>
+              <m:accPr>
+                <m:chr m:val="̂"/>
+              </m:accPr>
+              <m:e>
+                <m:r>
+                  <m:t>γ</m:t>
+                </m:r>
+              </m:e>
+            </m:acc>
+            <m:r>
+              <m:t>)</m:t>
+            </m:r>
+          </m:den>
+        </m:f>
+      </m:oMath>
+      <w:r>
+        <w:tab/>
+        <w:t>(5)</w:t>
+      </w:r>
+    </w:p>
+    <w:p>
+      <w:pPr>
+        <w:jc w:val="both"/>
+      </w:pPr>
+      <w:r>
+        <w:t>where z_i collects the participation determinants including the exclusion restrictions. Confidence intervals bootstrap both stages jointly (120 replications). As in any Heckman application, validity rests on the exclusion restrictions; we read the result as a robustness bound rather than causal identification.</w:t>
       </w:r>
     </w:p>
     <w:p>

</xml_diff>

<commit_message>
Fix two citations against primary sources (referee precision check)
Roussille (2024): published QJE title is 'The role of the ask gap in
gender pay inequality' -- 'Central' was only in the working paper
title. Verified against the published PDF: QJE 139(3), 1557-1610,
DOI 10.1093/qje/qjae004. Ask gap tightened from 'about 3%' to the
exact 2.9%; substantive claims (explains the entirety of residual
bid/final gaps; median feature drove gaps to zero) confirmed verbatim.

Parada-Contzen & Jara (2025): 17-25% range verified verbatim against
the published abstract (HSSC 12:961, DOI 10.1057/s41599-025-05312-x);
wording adjusted to the abstract's actual claims (pre-pandemic range,
2-5pp post-pandemic reduction, growing unexplained component,
heterogeneous effects by field) replacing 'mostly unexplained'.

Applied across all five documents (WP ES/EN, article, Estudios de
Economia and EPP submissions); four derived artifacts regenerated.

Co-Authored-By: Claude Fable 5 <noreply@anthropic.com>
</commit_message>
<xml_diff>
--- a/policy_paper/articulo/envio_estudios_de_economia/manuscrito_estudios_economia.docx
+++ b/policy_paper/articulo/envio_estudios_de_economia/manuscrito_estudios_economia.docx
@@ -265,7 +265,7 @@
         <w:jc w:val="both"/>
       </w:pPr>
       <w:r>
-        <w:t>Six strands define the local state of the art. Official statistics (INE/ESI) describe raw gaps by sex and broad occupation; we add multivariate adjustment with fine occupation and inference. Ñopo (2006), using CASEN 1992-2003 and comparisons restricted to the common support, documented an unexplained component of around 25% of average female wages, larger at top percentiles — fully consistent with the U-shape we report; we implement his decomposition with 4-digit matching in Section 6. Perticará and Bueno (2009), using the Social Protection Survey, controlled for actual labor market experience and intermittency — the critical variable our source does not observe; against that advantage, we contribute recency, sample scale, occupational granularity, and reproducibility. Sánchez et al. (2022) estimate, with unemployment-insurance administrative records and a dynamic monopsony model, that differences in firm-level labor supply elasticities can generate differentials of 19-28%; that channel is unobservable with our data and remains, by construction, inside our unexplained component. Berniell et al. (2023) document with event studies for Chile and other Latin American countries sharp and persistent declines in mothers' employment, hours, and earnings after the first birth, with essentially unaffected fathers; our cross-sectional parenthood coefficients are the static imprint of that process, consistent with — but not a substitute for — that causal evidence. Finally, Parada-Contzen and Jara (2025) document gaps of 17-25% by field of study among workers with higher education; we incorporate field of study directly in Section 6 and show that its contribution is largely absorbed by exact occupation.</w:t>
+        <w:t>Six strands define the local state of the art. Official statistics (INE/ESI) describe raw gaps by sex and broad occupation; we add multivariate adjustment with fine occupation and inference. Ñopo (2006), using CASEN 1992-2003 and comparisons restricted to the common support, documented an unexplained component of around 25% of average female wages, larger at top percentiles — fully consistent with the U-shape we report; we implement his decomposition with 4-digit matching in Section 6. Perticará and Bueno (2009), using the Social Protection Survey, controlled for actual labor market experience and intermittency — the critical variable our source does not observe; against that advantage, we contribute recency, sample scale, occupational granularity, and reproducibility. Sánchez et al. (2022) estimate, with unemployment-insurance administrative records and a dynamic monopsony model, that differences in firm-level labor supply elasticities can generate differentials of 19-28%; that channel is unobservable with our data and remains, by construction, inside our unexplained component. Berniell et al. (2023) document with event studies for Chile and other Latin American countries sharp and persistent declines in mothers' employment, hours, and earnings after the first birth, with essentially unaffected fathers; our cross-sectional parenthood coefficients are the static imprint of that process, consistent with — but not a substitute for — that causal evidence. Finally, Parada-Contzen and Jara (2025) document gaps of 17-25% before the pandemic among workers with higher education, with a growing unexplained component and heterogeneous effects across fields of study; we incorporate field of study directly in Section 6 and show that its contribution is largely absorbed by exact occupation.</w:t>
       </w:r>
     </w:p>
     <w:p>
@@ -4869,7 +4869,7 @@
         <w:jc w:val="both"/>
       </w:pPr>
       <w:r>
-        <w:t>The roughly two thirds of the gap that composition does not explain is not a black box. The international literature with experimental and administrative designs has named its components: the ask gap — women request about 3% less for the same profile, and displaying market medians eliminates the difference (Roussille, 2024; Leibbrandt &amp; List, 2015; Exley et al., 2020); overtime and schedule flexibility within occupations (Bolotnyy &amp; Emanuel, 2022; Goldin, 2014), whose imprint appears in our data both in the weight of hours and in the taxi-driver exception; competitiveness and personality attributes, which explain a small-to-moderate share (Niederle &amp; Vesterlund, 2007; Buser et al., 2014; Croson &amp; Gneezy, 2009; Mueller &amp; Plug, 2006; Heckman et al., 2006; Bertrand, 2011; Blau &amp; Kahn, 2017); firm-level sorting and bargaining, about one fifth of the gap where measurable (Card et al., 2016) and invisible to our data; and the dynamics of motherhood (Cortés &amp; Pan, 2023; Kleven et al., 2019; Berniell et al., 2023), whose static imprint we estimate at -7.8% within occupations. None of these mechanisms is measurable today with Chilean public data — household surveys include no modules on wage negotiation, actual work histories, or socioemotional attributes — which itself defines a data-infrastructure agenda.</w:t>
+        <w:t>The roughly two thirds of the gap that composition does not explain is not a black box. The international literature with experimental and administrative designs has named its components: the ask gap — women request 2.9% less for the same profile, and displaying market medians eliminates the difference (Roussille, 2024; Leibbrandt &amp; List, 2015; Exley et al., 2020); overtime and schedule flexibility within occupations (Bolotnyy &amp; Emanuel, 2022; Goldin, 2014), whose imprint appears in our data both in the weight of hours and in the taxi-driver exception; competitiveness and personality attributes, which explain a small-to-moderate share (Niederle &amp; Vesterlund, 2007; Buser et al., 2014; Croson &amp; Gneezy, 2009; Mueller &amp; Plug, 2006; Heckman et al., 2006; Bertrand, 2011; Blau &amp; Kahn, 2017); firm-level sorting and bargaining, about one fifth of the gap where measurable (Card et al., 2016) and invisible to our data; and the dynamics of motherhood (Cortés &amp; Pan, 2023; Kleven et al., 2019; Berniell et al., 2023), whose static imprint we estimate at -7.8% within occupations. None of these mechanisms is measurable today with Chilean public data — household surveys include no modules on wage negotiation, actual work histories, or socioemotional attributes — which itself defines a data-infrastructure agenda.</w:t>
       </w:r>
     </w:p>
     <w:p>
@@ -5751,7 +5751,7 @@
         <w:rPr>
           <w:sz w:val="22"/>
         </w:rPr>
-        <w:t>, Vol. 12.</w:t>
+        <w:t>, Vol. 12; Article 961.</w:t>
       </w:r>
     </w:p>
     <w:p>
@@ -5855,7 +5855,7 @@
         <w:rPr>
           <w:sz w:val="22"/>
         </w:rPr>
-        <w:t xml:space="preserve">Roussille, N. (2024). "The Central Role of the Ask Gap in Gender Pay Inequality", </w:t>
+        <w:t xml:space="preserve">Roussille, N. (2024). "The Role of the Ask Gap in Gender Pay Inequality", </w:t>
       </w:r>
       <w:r>
         <w:rPr>
@@ -5868,7 +5868,7 @@
         <w:rPr>
           <w:sz w:val="22"/>
         </w:rPr>
-        <w:t>, Vol. 139(3).</w:t>
+        <w:t>, Vol. 139(3); 1557-1610.</w:t>
       </w:r>
     </w:p>
     <w:p>

</xml_diff>